<commit_message>
updated final documentation and file path so that ./gradlew run points to the correct working directory
</commit_message>
<xml_diff>
--- a/Documentation/Lab1FinalDoc.docx
+++ b/Documentation/Lab1FinalDoc.docx
@@ -94,18 +94,10 @@
         <w:t xml:space="preserve"> |    Caller (</w:t>
       </w:r>
       <w:r>
-        <w:t xml:space="preserve">Utility </w:t>
-      </w:r>
-      <w:proofErr w:type="gramStart"/>
-      <w:r>
-        <w:t>File</w:t>
-      </w:r>
-      <w:r>
-        <w:t xml:space="preserve">)   </w:t>
-      </w:r>
-      <w:proofErr w:type="gramEnd"/>
-      <w:r>
-        <w:t xml:space="preserve">|&lt;---&gt;|   </w:t>
+        <w:t>Utility File</w:t>
+      </w:r>
+      <w:r>
+        <w:t xml:space="preserve">)   |&lt;---&gt;|   </w:t>
       </w:r>
       <w:proofErr w:type="spellStart"/>
       <w:r>
@@ -164,28 +156,12 @@
     </w:p>
     <w:p>
       <w:r>
-        <w:t xml:space="preserve">       (</w:t>
-      </w:r>
-      <w:proofErr w:type="gramStart"/>
-      <w:r>
-        <w:t xml:space="preserve">Fetch)   </w:t>
-      </w:r>
-      <w:proofErr w:type="gramEnd"/>
-      <w:r>
-        <w:t xml:space="preserve">         (Maps Page ID to Frame)</w:t>
-      </w:r>
-    </w:p>
-    <w:p>
-      <w:r>
-        <w:t xml:space="preserve">    Pin/Unpin Page       Eviction (</w:t>
-      </w:r>
-      <w:proofErr w:type="gramStart"/>
-      <w:r>
-        <w:t xml:space="preserve">LRU)   </w:t>
-      </w:r>
-      <w:proofErr w:type="gramEnd"/>
-      <w:r>
-        <w:t xml:space="preserve">          Write/Read Pages from Disk</w:t>
+        <w:t xml:space="preserve">       (Fetch)            (Maps Page ID to Frame)</w:t>
+      </w:r>
+    </w:p>
+    <w:p>
+      <w:r>
+        <w:t xml:space="preserve">    Pin/Unpin Page       Eviction (LRU)             Write/Read Pages from Disk</w:t>
       </w:r>
     </w:p>
     <w:p>
@@ -235,16 +211,11 @@
       <w:r>
         <w:t xml:space="preserve">main </w:t>
       </w:r>
-      <w:proofErr w:type="gramStart"/>
       <w:r>
         <w:t>memory</w:t>
       </w:r>
       <w:r>
-        <w:t>(</w:t>
-      </w:r>
-      <w:proofErr w:type="gramEnd"/>
-      <w:r>
-        <w:t>Cache)</w:t>
+        <w:t>(Cache)</w:t>
       </w:r>
       <w:r>
         <w:t xml:space="preserve">, </w:t>
@@ -276,7 +247,6 @@
         </w:numPr>
       </w:pPr>
       <w:proofErr w:type="spellStart"/>
-      <w:proofErr w:type="gramStart"/>
       <w:r>
         <w:rPr>
           <w:b/>
@@ -297,15 +267,7 @@
           <w:b/>
           <w:bCs/>
         </w:rPr>
-        <w:t>(</w:t>
-      </w:r>
-      <w:proofErr w:type="gramEnd"/>
-      <w:r>
-        <w:rPr>
-          <w:b/>
-          <w:bCs/>
-        </w:rPr>
-        <w:t xml:space="preserve">int </w:t>
+        <w:t xml:space="preserve">(int </w:t>
       </w:r>
       <w:proofErr w:type="spellStart"/>
       <w:r>
@@ -358,6 +320,17 @@
       </w:r>
       <w:r>
         <w:t xml:space="preserve"> If buffer Pool is full while getting the page details, it calls evict method.</w:t>
+      </w:r>
+      <w:r>
+        <w:t xml:space="preserve"> The offset for when to start reading in the file is computed as 4096 * </w:t>
+      </w:r>
+      <w:proofErr w:type="spellStart"/>
+      <w:r>
+        <w:t>pageId</w:t>
+      </w:r>
+      <w:proofErr w:type="spellEnd"/>
+      <w:r>
+        <w:t xml:space="preserve">. </w:t>
       </w:r>
     </w:p>
     <w:p>
@@ -368,7 +341,6 @@
         </w:numPr>
       </w:pPr>
       <w:proofErr w:type="spellStart"/>
-      <w:proofErr w:type="gramStart"/>
       <w:r>
         <w:rPr>
           <w:b/>
@@ -382,15 +354,7 @@
           <w:b/>
           <w:bCs/>
         </w:rPr>
-        <w:t>(</w:t>
-      </w:r>
-      <w:proofErr w:type="gramEnd"/>
-      <w:r>
-        <w:rPr>
-          <w:b/>
-          <w:bCs/>
-        </w:rPr>
-        <w:t>):</w:t>
+        <w:t>():</w:t>
       </w:r>
       <w:r>
         <w:t xml:space="preserve"> This</w:t>
@@ -413,7 +377,6 @@
         </w:numPr>
       </w:pPr>
       <w:proofErr w:type="spellStart"/>
-      <w:proofErr w:type="gramStart"/>
       <w:r>
         <w:rPr>
           <w:b/>
@@ -427,54 +390,49 @@
           <w:b/>
           <w:bCs/>
         </w:rPr>
+        <w:t>():</w:t>
+      </w:r>
+      <w:r>
+        <w:t xml:space="preserve"> </w:t>
+      </w:r>
+      <w:r>
+        <w:t>This method evicts the page when buffer pool is full. It</w:t>
+      </w:r>
+      <w:r>
+        <w:t xml:space="preserve"> implements the LRU eviction policy. It identifies the least recently used page</w:t>
+      </w:r>
+      <w:r>
+        <w:t xml:space="preserve"> </w:t>
+      </w:r>
+      <w:r>
         <w:t>(</w:t>
       </w:r>
-      <w:proofErr w:type="gramEnd"/>
-      <w:r>
-        <w:rPr>
-          <w:b/>
-          <w:bCs/>
-        </w:rPr>
-        <w:t>):</w:t>
+      <w:r>
+        <w:t>unpinned page</w:t>
+      </w:r>
+      <w:r>
+        <w:t>)</w:t>
+      </w:r>
+      <w:r>
+        <w:t xml:space="preserve"> and removes it from</w:t>
       </w:r>
       <w:r>
         <w:t xml:space="preserve"> </w:t>
       </w:r>
       <w:r>
-        <w:t>This method evicts the page when buffer pool is full. It</w:t>
-      </w:r>
-      <w:r>
-        <w:t xml:space="preserve"> implements the LRU eviction policy. It identifies the least recently used page</w:t>
+        <w:t>buffer</w:t>
       </w:r>
       <w:r>
         <w:t xml:space="preserve"> </w:t>
       </w:r>
       <w:r>
-        <w:t>(</w:t>
-      </w:r>
-      <w:r>
-        <w:t>unpinned page</w:t>
-      </w:r>
-      <w:r>
-        <w:t>)</w:t>
-      </w:r>
-      <w:r>
-        <w:t xml:space="preserve"> and removes it from</w:t>
-      </w:r>
-      <w:r>
-        <w:t xml:space="preserve"> </w:t>
-      </w:r>
-      <w:r>
-        <w:t>buffer</w:t>
-      </w:r>
-      <w:r>
-        <w:t xml:space="preserve"> </w:t>
-      </w:r>
-      <w:r>
         <w:t>pool</w:t>
       </w:r>
       <w:r>
         <w:t xml:space="preserve"> to make space for new pages. Before eviction, any dirty pages are written back to disk to prevent data loss.</w:t>
+      </w:r>
+      <w:r>
+        <w:t xml:space="preserve"> All other pages maintain their position in the LRU queue. </w:t>
       </w:r>
     </w:p>
     <w:p>
@@ -485,7 +443,6 @@
         </w:numPr>
       </w:pPr>
       <w:proofErr w:type="spellStart"/>
-      <w:proofErr w:type="gramStart"/>
       <w:r>
         <w:rPr>
           <w:b/>
@@ -499,15 +456,7 @@
           <w:b/>
           <w:bCs/>
         </w:rPr>
-        <w:t>(</w:t>
-      </w:r>
-      <w:proofErr w:type="gramEnd"/>
-      <w:r>
-        <w:rPr>
-          <w:b/>
-          <w:bCs/>
-        </w:rPr>
-        <w:t xml:space="preserve">int </w:t>
+        <w:t xml:space="preserve">(int </w:t>
       </w:r>
       <w:proofErr w:type="spellStart"/>
       <w:r>
@@ -543,7 +492,6 @@
         </w:numPr>
       </w:pPr>
       <w:proofErr w:type="spellStart"/>
-      <w:proofErr w:type="gramStart"/>
       <w:r>
         <w:rPr>
           <w:b/>
@@ -557,15 +505,7 @@
           <w:b/>
           <w:bCs/>
         </w:rPr>
-        <w:t>(</w:t>
-      </w:r>
-      <w:proofErr w:type="gramEnd"/>
-      <w:r>
-        <w:rPr>
-          <w:b/>
-          <w:bCs/>
-        </w:rPr>
-        <w:t xml:space="preserve">int </w:t>
+        <w:t xml:space="preserve">(int </w:t>
       </w:r>
       <w:proofErr w:type="spellStart"/>
       <w:r>
@@ -613,7 +553,6 @@
         </w:numPr>
       </w:pPr>
       <w:proofErr w:type="spellStart"/>
-      <w:proofErr w:type="gramStart"/>
       <w:r>
         <w:rPr>
           <w:b/>
@@ -627,15 +566,7 @@
           <w:b/>
           <w:bCs/>
         </w:rPr>
-        <w:t>(</w:t>
-      </w:r>
-      <w:proofErr w:type="gramEnd"/>
-      <w:r>
-        <w:rPr>
-          <w:b/>
-          <w:bCs/>
-        </w:rPr>
-        <w:t xml:space="preserve">int </w:t>
+        <w:t xml:space="preserve">(int </w:t>
       </w:r>
       <w:proofErr w:type="spellStart"/>
       <w:r>
@@ -669,15 +600,7 @@
         <w:t>e</w:t>
       </w:r>
       <w:r>
-        <w:t xml:space="preserve"> records are stored in </w:t>
-      </w:r>
-      <w:proofErr w:type="gramStart"/>
-      <w:r>
-        <w:t>9 byte</w:t>
-      </w:r>
-      <w:proofErr w:type="gramEnd"/>
-      <w:r>
-        <w:t xml:space="preserve"> chucks and the last byte is the amount of records stored on the page.</w:t>
+        <w:t xml:space="preserve"> records are stored in 9 byte chucks and the last byte is the amount of records stored on the page.</w:t>
       </w:r>
     </w:p>
     <w:p>
@@ -688,7 +611,6 @@
         </w:numPr>
       </w:pPr>
       <w:proofErr w:type="spellStart"/>
-      <w:proofErr w:type="gramStart"/>
       <w:r>
         <w:rPr>
           <w:b/>
@@ -703,15 +625,7 @@
           <w:b/>
           <w:bCs/>
         </w:rPr>
-        <w:t>(</w:t>
-      </w:r>
-      <w:proofErr w:type="gramEnd"/>
-      <w:r>
-        <w:rPr>
-          <w:b/>
-          <w:bCs/>
-        </w:rPr>
-        <w:t xml:space="preserve">int </w:t>
+        <w:t xml:space="preserve">(int </w:t>
       </w:r>
       <w:proofErr w:type="spellStart"/>
       <w:r>
@@ -744,7 +658,6 @@
         </w:numPr>
       </w:pPr>
       <w:proofErr w:type="spellStart"/>
-      <w:proofErr w:type="gramStart"/>
       <w:r>
         <w:rPr>
           <w:b/>
@@ -758,22 +671,7 @@
           <w:b/>
           <w:bCs/>
         </w:rPr>
-        <w:t>(</w:t>
-      </w:r>
-      <w:proofErr w:type="gramEnd"/>
-      <w:r>
-        <w:rPr>
-          <w:b/>
-          <w:bCs/>
-        </w:rPr>
-        <w:t>)</w:t>
-      </w:r>
-      <w:r>
-        <w:rPr>
-          <w:b/>
-          <w:bCs/>
-        </w:rPr>
-        <w:t>:</w:t>
+        <w:t>():</w:t>
       </w:r>
       <w:r>
         <w:t xml:space="preserve"> This method gives the id for next page when </w:t>
@@ -813,7 +711,6 @@
         </w:numPr>
       </w:pPr>
       <w:proofErr w:type="spellStart"/>
-      <w:proofErr w:type="gramStart"/>
       <w:r>
         <w:rPr>
           <w:b/>
@@ -827,15 +724,7 @@
           <w:b/>
           <w:bCs/>
         </w:rPr>
-        <w:t>(</w:t>
-      </w:r>
-      <w:proofErr w:type="gramEnd"/>
-      <w:r>
-        <w:rPr>
-          <w:b/>
-          <w:bCs/>
-        </w:rPr>
-        <w:t xml:space="preserve">int </w:t>
+        <w:t xml:space="preserve">(int </w:t>
       </w:r>
       <w:proofErr w:type="spellStart"/>
       <w:r>
@@ -924,7 +813,6 @@
         </w:numPr>
       </w:pPr>
       <w:proofErr w:type="spellStart"/>
-      <w:proofErr w:type="gramStart"/>
       <w:r>
         <w:rPr>
           <w:b/>
@@ -938,15 +826,7 @@
           <w:b/>
           <w:bCs/>
         </w:rPr>
-        <w:t>(</w:t>
-      </w:r>
-      <w:proofErr w:type="gramEnd"/>
-      <w:r>
-        <w:rPr>
-          <w:b/>
-          <w:bCs/>
-        </w:rPr>
-        <w:t xml:space="preserve">int </w:t>
+        <w:t xml:space="preserve">(int </w:t>
       </w:r>
       <w:proofErr w:type="spellStart"/>
       <w:r>
@@ -976,7 +856,6 @@
         </w:numPr>
       </w:pPr>
       <w:proofErr w:type="spellStart"/>
-      <w:proofErr w:type="gramStart"/>
       <w:r>
         <w:rPr>
           <w:b/>
@@ -990,15 +869,7 @@
           <w:b/>
           <w:bCs/>
         </w:rPr>
-        <w:t>(</w:t>
-      </w:r>
-      <w:proofErr w:type="gramEnd"/>
-      <w:r>
-        <w:rPr>
-          <w:b/>
-          <w:bCs/>
-        </w:rPr>
-        <w:t>Row row):</w:t>
+        <w:t>(Row row):</w:t>
       </w:r>
       <w:r>
         <w:t xml:space="preserve"> This method inserts a new row into the page. If the page is full, the insertion is rejected, and a new page must be created.</w:t>
@@ -1021,7 +892,6 @@
         </w:numPr>
       </w:pPr>
       <w:proofErr w:type="spellStart"/>
-      <w:proofErr w:type="gramStart"/>
       <w:r>
         <w:rPr>
           <w:b/>
@@ -1035,15 +905,7 @@
           <w:b/>
           <w:bCs/>
         </w:rPr>
-        <w:t>(</w:t>
-      </w:r>
-      <w:proofErr w:type="gramEnd"/>
-      <w:r>
-        <w:rPr>
-          <w:b/>
-          <w:bCs/>
-        </w:rPr>
-        <w:t>):</w:t>
+        <w:t>():</w:t>
       </w:r>
       <w:r>
         <w:t xml:space="preserve"> This method checks whether the page has reached its capacity.</w:t>
@@ -1061,7 +923,6 @@
         </w:rPr>
       </w:pPr>
       <w:proofErr w:type="spellStart"/>
-      <w:proofErr w:type="gramStart"/>
       <w:r>
         <w:rPr>
           <w:b/>
@@ -1075,15 +936,7 @@
           <w:b/>
           <w:bCs/>
         </w:rPr>
-        <w:t>(</w:t>
-      </w:r>
-      <w:proofErr w:type="gramEnd"/>
-      <w:r>
-        <w:rPr>
-          <w:b/>
-          <w:bCs/>
-        </w:rPr>
-        <w:t>)</w:t>
+        <w:t>()</w:t>
       </w:r>
       <w:r>
         <w:rPr>
@@ -1110,7 +963,6 @@
         </w:numPr>
       </w:pPr>
       <w:proofErr w:type="spellStart"/>
-      <w:proofErr w:type="gramStart"/>
       <w:r>
         <w:rPr>
           <w:b/>
@@ -1124,15 +976,7 @@
           <w:b/>
           <w:bCs/>
         </w:rPr>
-        <w:t>(</w:t>
-      </w:r>
-      <w:proofErr w:type="gramEnd"/>
-      <w:r>
-        <w:rPr>
-          <w:b/>
-          <w:bCs/>
-        </w:rPr>
-        <w:t xml:space="preserve">int </w:t>
+        <w:t xml:space="preserve">(int </w:t>
       </w:r>
       <w:proofErr w:type="spellStart"/>
       <w:r>
@@ -1175,7 +1019,6 @@
         </w:numPr>
       </w:pPr>
       <w:proofErr w:type="spellStart"/>
-      <w:proofErr w:type="gramStart"/>
       <w:r>
         <w:rPr>
           <w:b/>
@@ -1189,22 +1032,7 @@
           <w:b/>
           <w:bCs/>
         </w:rPr>
-        <w:t>(</w:t>
-      </w:r>
-      <w:proofErr w:type="gramEnd"/>
-      <w:r>
-        <w:rPr>
-          <w:b/>
-          <w:bCs/>
-        </w:rPr>
-        <w:t>)</w:t>
-      </w:r>
-      <w:r>
-        <w:rPr>
-          <w:b/>
-          <w:bCs/>
-        </w:rPr>
-        <w:t>:</w:t>
+        <w:t>():</w:t>
       </w:r>
       <w:r>
         <w:t xml:space="preserve"> This method increments pin count which is stored in a property of page.</w:t>
@@ -1218,7 +1046,6 @@
         </w:numPr>
       </w:pPr>
       <w:proofErr w:type="spellStart"/>
-      <w:proofErr w:type="gramStart"/>
       <w:r>
         <w:rPr>
           <w:b/>
@@ -1232,34 +1059,10 @@
           <w:b/>
           <w:bCs/>
         </w:rPr>
-        <w:t>(</w:t>
-      </w:r>
-      <w:proofErr w:type="gramEnd"/>
-      <w:r>
-        <w:rPr>
-          <w:b/>
-          <w:bCs/>
-        </w:rPr>
-        <w:t>)</w:t>
-      </w:r>
-      <w:r>
-        <w:rPr>
-          <w:b/>
-          <w:bCs/>
-        </w:rPr>
-        <w:t>:</w:t>
-      </w:r>
-      <w:r>
-        <w:t xml:space="preserve"> </w:t>
-      </w:r>
-      <w:r>
-        <w:t xml:space="preserve">This method </w:t>
-      </w:r>
-      <w:r>
-        <w:t>de</w:t>
-      </w:r>
-      <w:r>
-        <w:t>crements pin count which is stored in a property of page.</w:t>
+        <w:t>():</w:t>
+      </w:r>
+      <w:r>
+        <w:t xml:space="preserve"> This method decrements pin count which is stored in a property of page.</w:t>
       </w:r>
     </w:p>
     <w:p>
@@ -1270,7 +1073,6 @@
         </w:numPr>
       </w:pPr>
       <w:proofErr w:type="spellStart"/>
-      <w:proofErr w:type="gramStart"/>
       <w:r>
         <w:rPr>
           <w:b/>
@@ -1284,22 +1086,7 @@
           <w:b/>
           <w:bCs/>
         </w:rPr>
-        <w:t>(</w:t>
-      </w:r>
-      <w:proofErr w:type="gramEnd"/>
-      <w:r>
-        <w:rPr>
-          <w:b/>
-          <w:bCs/>
-        </w:rPr>
-        <w:t>)</w:t>
-      </w:r>
-      <w:r>
-        <w:rPr>
-          <w:b/>
-          <w:bCs/>
-        </w:rPr>
-        <w:t>:</w:t>
+        <w:t>():</w:t>
       </w:r>
       <w:r>
         <w:t xml:space="preserve"> This method returns pin count.</w:t>
@@ -1313,7 +1100,6 @@
         </w:numPr>
       </w:pPr>
       <w:proofErr w:type="spellStart"/>
-      <w:proofErr w:type="gramStart"/>
       <w:r>
         <w:rPr>
           <w:b/>
@@ -1327,15 +1113,7 @@
           <w:b/>
           <w:bCs/>
         </w:rPr>
-        <w:t>(</w:t>
-      </w:r>
-      <w:proofErr w:type="gramEnd"/>
-      <w:r>
-        <w:rPr>
-          <w:b/>
-          <w:bCs/>
-        </w:rPr>
-        <w:t>):</w:t>
+        <w:t>():</w:t>
       </w:r>
       <w:r>
         <w:t xml:space="preserve"> Returns an array containing all the rows currently stored in the page.</w:t>
@@ -1353,7 +1131,6 @@
         </w:rPr>
       </w:pPr>
       <w:proofErr w:type="spellStart"/>
-      <w:proofErr w:type="gramStart"/>
       <w:r>
         <w:rPr>
           <w:b/>
@@ -1367,15 +1144,7 @@
           <w:b/>
           <w:bCs/>
         </w:rPr>
-        <w:t>(</w:t>
-      </w:r>
-      <w:proofErr w:type="gramEnd"/>
-      <w:r>
-        <w:rPr>
-          <w:b/>
-          <w:bCs/>
-        </w:rPr>
-        <w:t>)</w:t>
+        <w:t>()</w:t>
       </w:r>
       <w:r>
         <w:rPr>
@@ -1400,7 +1169,6 @@
         </w:rPr>
       </w:pPr>
       <w:proofErr w:type="spellStart"/>
-      <w:proofErr w:type="gramStart"/>
       <w:r>
         <w:rPr>
           <w:b/>
@@ -1414,15 +1182,7 @@
           <w:b/>
           <w:bCs/>
         </w:rPr>
-        <w:t>(</w:t>
-      </w:r>
-      <w:proofErr w:type="gramEnd"/>
-      <w:r>
-        <w:rPr>
-          <w:b/>
-          <w:bCs/>
-        </w:rPr>
-        <w:t>Row[] rows)</w:t>
+        <w:t>(Row[] rows)</w:t>
       </w:r>
       <w:r>
         <w:rPr>
@@ -1455,7 +1215,6 @@
         </w:rPr>
       </w:pPr>
       <w:proofErr w:type="spellStart"/>
-      <w:proofErr w:type="gramStart"/>
       <w:r>
         <w:rPr>
           <w:b/>
@@ -1469,15 +1228,7 @@
           <w:b/>
           <w:bCs/>
         </w:rPr>
-        <w:t>(</w:t>
-      </w:r>
-      <w:proofErr w:type="gramEnd"/>
-      <w:r>
-        <w:rPr>
-          <w:b/>
-          <w:bCs/>
-        </w:rPr>
-        <w:t xml:space="preserve">int </w:t>
+        <w:t xml:space="preserve">(int </w:t>
       </w:r>
       <w:proofErr w:type="spellStart"/>
       <w:r>
@@ -1543,7 +1294,6 @@
         </w:rPr>
       </w:pPr>
       <w:proofErr w:type="spellStart"/>
-      <w:proofErr w:type="gramStart"/>
       <w:r>
         <w:rPr>
           <w:b/>
@@ -1557,15 +1307,7 @@
           <w:b/>
           <w:bCs/>
         </w:rPr>
-        <w:t>(</w:t>
-      </w:r>
-      <w:proofErr w:type="gramEnd"/>
-      <w:r>
-        <w:rPr>
-          <w:b/>
-          <w:bCs/>
-        </w:rPr>
-        <w:t>)</w:t>
+        <w:t>()</w:t>
       </w:r>
       <w:r>
         <w:rPr>
@@ -1586,7 +1328,6 @@
         </w:numPr>
       </w:pPr>
       <w:proofErr w:type="spellStart"/>
-      <w:proofErr w:type="gramStart"/>
       <w:r>
         <w:rPr>
           <w:b/>
@@ -1601,15 +1342,7 @@
           <w:b/>
           <w:bCs/>
         </w:rPr>
-        <w:t>(</w:t>
-      </w:r>
-      <w:proofErr w:type="gramEnd"/>
-      <w:r>
-        <w:rPr>
-          <w:b/>
-          <w:bCs/>
-        </w:rPr>
-        <w:t>):</w:t>
+        <w:t>():</w:t>
       </w:r>
       <w:r>
         <w:t xml:space="preserve"> When a page is modified, it is marked as dirty. This ensures that changes are persisted to disk before the page is evicted from memory.</w:t>
@@ -1630,7 +1363,6 @@
         </w:rPr>
       </w:pPr>
       <w:proofErr w:type="spellStart"/>
-      <w:proofErr w:type="gramStart"/>
       <w:r>
         <w:rPr>
           <w:b/>
@@ -1644,15 +1376,7 @@
           <w:b/>
           <w:bCs/>
         </w:rPr>
-        <w:t>(</w:t>
-      </w:r>
-      <w:proofErr w:type="gramEnd"/>
-      <w:r>
-        <w:rPr>
-          <w:b/>
-          <w:bCs/>
-        </w:rPr>
-        <w:t xml:space="preserve">): </w:t>
+        <w:t xml:space="preserve">(): </w:t>
       </w:r>
       <w:r>
         <w:t xml:space="preserve">This method removes the dirty tag from the page which is it changes the </w:t>
@@ -1678,7 +1402,6 @@
         </w:rPr>
       </w:pPr>
       <w:proofErr w:type="spellStart"/>
-      <w:proofErr w:type="gramStart"/>
       <w:r>
         <w:rPr>
           <w:b/>
@@ -1692,15 +1415,7 @@
           <w:b/>
           <w:bCs/>
         </w:rPr>
-        <w:t>(</w:t>
-      </w:r>
-      <w:proofErr w:type="gramEnd"/>
-      <w:r>
-        <w:rPr>
-          <w:b/>
-          <w:bCs/>
-        </w:rPr>
-        <w:t>)</w:t>
+        <w:t>()</w:t>
       </w:r>
       <w:r>
         <w:rPr>
@@ -1727,7 +1442,6 @@
         </w:numPr>
       </w:pPr>
       <w:proofErr w:type="spellStart"/>
-      <w:proofErr w:type="gramStart"/>
       <w:r>
         <w:rPr>
           <w:b/>
@@ -1741,15 +1455,7 @@
           <w:b/>
           <w:bCs/>
         </w:rPr>
-        <w:t>(</w:t>
-      </w:r>
-      <w:proofErr w:type="gramEnd"/>
-      <w:r>
-        <w:rPr>
-          <w:b/>
-          <w:bCs/>
-        </w:rPr>
-        <w:t>)</w:t>
+        <w:t>()</w:t>
       </w:r>
       <w:r>
         <w:rPr>
@@ -1787,7 +1493,6 @@
         </w:rPr>
       </w:pPr>
       <w:proofErr w:type="spellStart"/>
-      <w:proofErr w:type="gramStart"/>
       <w:r>
         <w:rPr>
           <w:b/>
@@ -1801,15 +1506,7 @@
           <w:b/>
           <w:bCs/>
         </w:rPr>
-        <w:t>(</w:t>
-      </w:r>
-      <w:proofErr w:type="gramEnd"/>
-      <w:r>
-        <w:rPr>
-          <w:b/>
-          <w:bCs/>
-        </w:rPr>
-        <w:t>)</w:t>
+        <w:t>()</w:t>
       </w:r>
       <w:r>
         <w:rPr>
@@ -1865,7 +1562,6 @@
         </w:numPr>
       </w:pPr>
       <w:proofErr w:type="spellStart"/>
-      <w:proofErr w:type="gramStart"/>
       <w:r>
         <w:rPr>
           <w:b/>
@@ -1882,7 +1578,6 @@
         <w:t>(</w:t>
       </w:r>
       <w:proofErr w:type="spellStart"/>
-      <w:proofErr w:type="gramEnd"/>
       <w:r>
         <w:rPr>
           <w:b/>
@@ -2108,7 +1803,7 @@
       <w:r>
         <w:t xml:space="preserve"> </w:t>
       </w:r>
-      <w:hyperlink r:id="rId6" w:history="1">
+      <w:hyperlink r:id="rId6" w:anchor="change-project-sdk" w:history="1">
         <w:r>
           <w:rPr>
             <w:rStyle w:val="Hyperlink"/>
@@ -2137,13 +1832,8 @@
         <w:t>uc</w:t>
       </w:r>
       <w:r>
-        <w:t xml:space="preserve">tions can be found </w:t>
-      </w:r>
-      <w:proofErr w:type="gramStart"/>
-      <w:r>
-        <w:t>here :</w:t>
-      </w:r>
-      <w:proofErr w:type="gramEnd"/>
+        <w:t>tions can be found here :</w:t>
+      </w:r>
       <w:r>
         <w:t xml:space="preserve"> </w:t>
       </w:r>
@@ -2177,7 +1867,7 @@
         <mc:AlternateContent>
           <mc:Choice Requires="wps">
             <w:drawing>
-              <wp:anchor distT="45720" distB="45720" distL="114300" distR="114300" simplePos="0" relativeHeight="251659264" behindDoc="0" locked="0" layoutInCell="1" allowOverlap="1">
+              <wp:anchor distT="45720" distB="45720" distL="114300" distR="114300" simplePos="0" relativeHeight="251659264" behindDoc="0" locked="0" layoutInCell="1" allowOverlap="1" wp14:anchorId="1659255B" wp14:editId="74FADB2A">
                 <wp:simplePos x="0" y="0"/>
                 <wp:positionH relativeFrom="margin">
                   <wp:align>right</wp:align>
@@ -2249,15 +1939,7 @@
                             </w:r>
                             <w:proofErr w:type="spellEnd"/>
                             <w:r>
-                              <w:t xml:space="preserve"> '</w:t>
-                            </w:r>
-                            <w:proofErr w:type="gramStart"/>
-                            <w:r>
-                              <w:t>org.junit</w:t>
-                            </w:r>
-                            <w:proofErr w:type="gramEnd"/>
-                            <w:r>
-                              <w:t>.jupiter:junit-jupiter-api:5.9.2'</w:t>
+                              <w:t xml:space="preserve"> 'org.junit.jupiter:junit-jupiter-api:5.9.2'</w:t>
                             </w:r>
                           </w:p>
                           <w:p>
@@ -2271,15 +1953,7 @@
                             </w:r>
                             <w:proofErr w:type="spellEnd"/>
                             <w:r>
-                              <w:t xml:space="preserve"> '</w:t>
-                            </w:r>
-                            <w:proofErr w:type="gramStart"/>
-                            <w:r>
-                              <w:t>org.junit</w:t>
-                            </w:r>
-                            <w:proofErr w:type="gramEnd"/>
-                            <w:r>
-                              <w:t>.jupiter:junit-jupiter-engine:5.9.2'</w:t>
+                              <w:t xml:space="preserve"> 'org.junit.jupiter:junit-jupiter-engine:5.9.2'</w:t>
                             </w:r>
                           </w:p>
                           <w:p>
@@ -2302,15 +1976,7 @@
                             </w:r>
                             <w:proofErr w:type="spellEnd"/>
                             <w:r>
-                              <w:t xml:space="preserve"> '</w:t>
-                            </w:r>
-                            <w:proofErr w:type="gramStart"/>
-                            <w:r>
-                              <w:t>org.mockito</w:t>
-                            </w:r>
-                            <w:proofErr w:type="gramEnd"/>
-                            <w:r>
-                              <w:t>:mockito-core:4.11.0'</w:t>
+                              <w:t xml:space="preserve"> 'org.mockito:mockito-core:4.11.0'</w:t>
                             </w:r>
                           </w:p>
                           <w:p>
@@ -2324,15 +1990,7 @@
                             </w:r>
                             <w:proofErr w:type="spellEnd"/>
                             <w:r>
-                              <w:t xml:space="preserve"> '</w:t>
-                            </w:r>
-                            <w:proofErr w:type="gramStart"/>
-                            <w:r>
-                              <w:t>org.mockito</w:t>
-                            </w:r>
-                            <w:proofErr w:type="gramEnd"/>
-                            <w:r>
-                              <w:t>:mockito-junit-jupiter:4.11.0'</w:t>
+                              <w:t xml:space="preserve"> 'org.mockito:mockito-junit-jupiter:4.11.0'</w:t>
                             </w:r>
                           </w:p>
                           <w:p>
@@ -2350,15 +2008,7 @@
                               <w:ind w:left="720"/>
                             </w:pPr>
                             <w:r>
-                              <w:t>implementation '</w:t>
-                            </w:r>
-                            <w:proofErr w:type="gramStart"/>
-                            <w:r>
-                              <w:t>com.google</w:t>
-                            </w:r>
-                            <w:proofErr w:type="gramEnd"/>
-                            <w:r>
-                              <w:t>.guava:guava:32.1.2-jre' // Explicitly define Guava version</w:t>
+                              <w:t>implementation 'com.google.guava:guava:32.1.2-jre' // Explicitly define Guava version</w:t>
                             </w:r>
                           </w:p>
                           <w:p>
@@ -2390,7 +2040,7 @@
           </mc:Choice>
           <mc:Fallback>
             <w:pict>
-              <v:shapetype id="_x0000_t202" coordsize="21600,21600" o:spt="202" path="m,l,21600r21600,l21600,xe">
+              <v:shapetype w14:anchorId="1659255B" id="_x0000_t202" coordsize="21600,21600" o:spt="202" path="m,l,21600r21600,l21600,xe">
                 <v:stroke joinstyle="miter"/>
                 <v:path gradientshapeok="t" o:connecttype="rect"/>
               </v:shapetype>
@@ -2426,15 +2076,7 @@
                       </w:r>
                       <w:proofErr w:type="spellEnd"/>
                       <w:r>
-                        <w:t xml:space="preserve"> '</w:t>
-                      </w:r>
-                      <w:proofErr w:type="gramStart"/>
-                      <w:r>
-                        <w:t>org.junit</w:t>
-                      </w:r>
-                      <w:proofErr w:type="gramEnd"/>
-                      <w:r>
-                        <w:t>.jupiter:junit-jupiter-api:5.9.2'</w:t>
+                        <w:t xml:space="preserve"> 'org.junit.jupiter:junit-jupiter-api:5.9.2'</w:t>
                       </w:r>
                     </w:p>
                     <w:p>
@@ -2448,15 +2090,7 @@
                       </w:r>
                       <w:proofErr w:type="spellEnd"/>
                       <w:r>
-                        <w:t xml:space="preserve"> '</w:t>
-                      </w:r>
-                      <w:proofErr w:type="gramStart"/>
-                      <w:r>
-                        <w:t>org.junit</w:t>
-                      </w:r>
-                      <w:proofErr w:type="gramEnd"/>
-                      <w:r>
-                        <w:t>.jupiter:junit-jupiter-engine:5.9.2'</w:t>
+                        <w:t xml:space="preserve"> 'org.junit.jupiter:junit-jupiter-engine:5.9.2'</w:t>
                       </w:r>
                     </w:p>
                     <w:p>
@@ -2479,15 +2113,7 @@
                       </w:r>
                       <w:proofErr w:type="spellEnd"/>
                       <w:r>
-                        <w:t xml:space="preserve"> '</w:t>
-                      </w:r>
-                      <w:proofErr w:type="gramStart"/>
-                      <w:r>
-                        <w:t>org.mockito</w:t>
-                      </w:r>
-                      <w:proofErr w:type="gramEnd"/>
-                      <w:r>
-                        <w:t>:mockito-core:4.11.0'</w:t>
+                        <w:t xml:space="preserve"> 'org.mockito:mockito-core:4.11.0'</w:t>
                       </w:r>
                     </w:p>
                     <w:p>
@@ -2501,15 +2127,7 @@
                       </w:r>
                       <w:proofErr w:type="spellEnd"/>
                       <w:r>
-                        <w:t xml:space="preserve"> '</w:t>
-                      </w:r>
-                      <w:proofErr w:type="gramStart"/>
-                      <w:r>
-                        <w:t>org.mockito</w:t>
-                      </w:r>
-                      <w:proofErr w:type="gramEnd"/>
-                      <w:r>
-                        <w:t>:mockito-junit-jupiter:4.11.0'</w:t>
+                        <w:t xml:space="preserve"> 'org.mockito:mockito-junit-jupiter:4.11.0'</w:t>
                       </w:r>
                     </w:p>
                     <w:p>
@@ -2527,15 +2145,7 @@
                         <w:ind w:left="720"/>
                       </w:pPr>
                       <w:r>
-                        <w:t>implementation '</w:t>
-                      </w:r>
-                      <w:proofErr w:type="gramStart"/>
-                      <w:r>
-                        <w:t>com.google</w:t>
-                      </w:r>
-                      <w:proofErr w:type="gramEnd"/>
-                      <w:r>
-                        <w:t>.guava:guava:32.1.2-jre' // Explicitly define Guava version</w:t>
+                        <w:t>implementation 'com.google.guava:guava:32.1.2-jre' // Explicitly define Guava version</w:t>
                       </w:r>
                     </w:p>
                     <w:p>
@@ -2560,17 +2170,12 @@
         <w:t xml:space="preserve">Make sure to add following dependencies in </w:t>
       </w:r>
       <w:proofErr w:type="spellStart"/>
-      <w:proofErr w:type="gramStart"/>
       <w:r>
         <w:t>build.gradle</w:t>
       </w:r>
       <w:proofErr w:type="spellEnd"/>
-      <w:proofErr w:type="gramEnd"/>
-      <w:r>
-        <w:t xml:space="preserve"> file</w:t>
-      </w:r>
-      <w:r>
-        <w:t>:</w:t>
+      <w:r>
+        <w:t xml:space="preserve"> file:</w:t>
       </w:r>
     </w:p>
     <w:p>
@@ -2587,15 +2192,7 @@
         </w:numPr>
       </w:pPr>
       <w:r>
-        <w:t xml:space="preserve">Download the </w:t>
-      </w:r>
-      <w:proofErr w:type="gramStart"/>
-      <w:r>
-        <w:t>dataset  name</w:t>
-      </w:r>
-      <w:proofErr w:type="gramEnd"/>
-      <w:r>
-        <w:t xml:space="preserve"> : </w:t>
+        <w:t xml:space="preserve">Download the dataset  name : </w:t>
       </w:r>
       <w:hyperlink r:id="rId8" w:history="1">
         <w:r>
@@ -2687,7 +2284,40 @@
         </w:numPr>
       </w:pPr>
       <w:r>
-        <w:t>Change the path name and filename in main file.</w:t>
+        <w:t xml:space="preserve">Place </w:t>
+      </w:r>
+      <w:proofErr w:type="spellStart"/>
+      <w:r>
+        <w:t>title.basics.tsv</w:t>
+      </w:r>
+      <w:proofErr w:type="spellEnd"/>
+      <w:r>
+        <w:t xml:space="preserve"> in </w:t>
+      </w:r>
+      <w:r>
+        <w:t>the directory above</w:t>
+      </w:r>
+      <w:r>
+        <w:t>.</w:t>
+      </w:r>
+      <w:r>
+        <w:t xml:space="preserve"> We did not include this on the </w:t>
+      </w:r>
+      <w:proofErr w:type="spellStart"/>
+      <w:r>
+        <w:t>github</w:t>
+      </w:r>
+      <w:proofErr w:type="spellEnd"/>
+      <w:r>
+        <w:t xml:space="preserve"> repo as the </w:t>
+      </w:r>
+      <w:proofErr w:type="spellStart"/>
+      <w:r>
+        <w:t>filesize</w:t>
+      </w:r>
+      <w:proofErr w:type="spellEnd"/>
+      <w:r>
+        <w:t xml:space="preserve"> is large. </w:t>
       </w:r>
     </w:p>
     <w:p>
@@ -2699,6 +2329,128 @@
         </w:numPr>
       </w:pPr>
       <w:r>
+        <w:t xml:space="preserve">Place </w:t>
+      </w:r>
+      <w:proofErr w:type="spellStart"/>
+      <w:r>
+        <w:t>title.basics.tsv</w:t>
+      </w:r>
+      <w:proofErr w:type="spellEnd"/>
+      <w:r>
+        <w:t xml:space="preserve"> under </w:t>
+      </w:r>
+      <w:r>
+        <w:t>app/</w:t>
+      </w:r>
+      <w:proofErr w:type="spellStart"/>
+      <w:r>
+        <w:t>src</w:t>
+      </w:r>
+      <w:proofErr w:type="spellEnd"/>
+      <w:r>
+        <w:t>/</w:t>
+      </w:r>
+      <w:r>
+        <w:t>test</w:t>
+      </w:r>
+      <w:r>
+        <w:t>/java/project_645/DB files</w:t>
+      </w:r>
+    </w:p>
+    <w:p>
+      <w:pPr>
+        <w:pStyle w:val="ListParagraph"/>
+        <w:numPr>
+          <w:ilvl w:val="1"/>
+          <w:numId w:val="10"/>
+        </w:numPr>
+        <w:rPr>
+          <w:lang w:val="en-US"/>
+        </w:rPr>
+      </w:pPr>
+      <w:r>
+        <w:t>Note, the paths in these files have been set up such that they will work on any machine regardless of the relative directory of the root of the project. However, in practice this may cause issues. If tests do not run, please modify “</w:t>
+      </w:r>
+      <w:proofErr w:type="spellStart"/>
+      <w:r>
+        <w:t>testFileDirectory</w:t>
+      </w:r>
+      <w:proofErr w:type="spellEnd"/>
+      <w:r>
+        <w:t xml:space="preserve">” in </w:t>
+      </w:r>
+      <w:proofErr w:type="spellStart"/>
+      <w:r>
+        <w:t>BufferImplUnitTests</w:t>
+      </w:r>
+      <w:proofErr w:type="spellEnd"/>
+      <w:r>
+        <w:t xml:space="preserve"> and </w:t>
+      </w:r>
+      <w:proofErr w:type="spellStart"/>
+      <w:r>
+        <w:t>TATests</w:t>
+      </w:r>
+      <w:proofErr w:type="spellEnd"/>
+      <w:r>
+        <w:t xml:space="preserve"> to match the </w:t>
+      </w:r>
+      <w:proofErr w:type="spellStart"/>
+      <w:r>
+        <w:t>filepath</w:t>
+      </w:r>
+      <w:proofErr w:type="spellEnd"/>
+      <w:r>
+        <w:t xml:space="preserve"> corresponding to </w:t>
+      </w:r>
+      <w:r>
+        <w:rPr>
+          <w:lang w:val="en-US"/>
+        </w:rPr>
+        <w:t>/</w:t>
+      </w:r>
+      <w:proofErr w:type="spellStart"/>
+      <w:r>
+        <w:rPr>
+          <w:lang w:val="en-US"/>
+        </w:rPr>
+        <w:t>src</w:t>
+      </w:r>
+      <w:proofErr w:type="spellEnd"/>
+      <w:r>
+        <w:rPr>
+          <w:lang w:val="en-US"/>
+        </w:rPr>
+        <w:t>/test/java/project_645/DB files/</w:t>
+      </w:r>
+      <w:r>
+        <w:rPr>
+          <w:lang w:val="en-US"/>
+        </w:rPr>
+        <w:t>.</w:t>
+      </w:r>
+    </w:p>
+    <w:p>
+      <w:pPr>
+        <w:pStyle w:val="ListParagraph"/>
+        <w:numPr>
+          <w:ilvl w:val="0"/>
+          <w:numId w:val="10"/>
+        </w:numPr>
+      </w:pPr>
+      <w:r>
+        <w:t>Change the path name and filename in main file.</w:t>
+      </w:r>
+    </w:p>
+    <w:p>
+      <w:pPr>
+        <w:pStyle w:val="ListParagraph"/>
+        <w:numPr>
+          <w:ilvl w:val="0"/>
+          <w:numId w:val="10"/>
+        </w:numPr>
+      </w:pPr>
+      <w:r>
         <w:t xml:space="preserve">Have </w:t>
       </w:r>
       <w:proofErr w:type="spellStart"/>
@@ -2807,11 +2559,7 @@
         </w:rPr>
       </w:pPr>
       <w:r>
-        <w:t xml:space="preserve">Build the </w:t>
-      </w:r>
-      <w:proofErr w:type="gramStart"/>
-      <w:r>
-        <w:t xml:space="preserve">project </w:t>
+        <w:t xml:space="preserve">Build the project </w:t>
       </w:r>
       <w:r>
         <w:rPr>
@@ -2820,7 +2568,6 @@
         </w:rPr>
         <w:t>:</w:t>
       </w:r>
-      <w:proofErr w:type="gramEnd"/>
       <w:r>
         <w:rPr>
           <w:b/>
@@ -2874,26 +2621,15 @@
         </w:numPr>
       </w:pPr>
       <w:r>
-        <w:t>Run the project</w:t>
-      </w:r>
-      <w:proofErr w:type="gramStart"/>
-      <w:r>
-        <w:t xml:space="preserve">: </w:t>
-      </w:r>
-      <w:r>
-        <w:rPr>
-          <w:b/>
-          <w:bCs/>
-        </w:rPr>
-        <w:t>.</w:t>
-      </w:r>
-      <w:proofErr w:type="gramEnd"/>
-      <w:r>
-        <w:rPr>
-          <w:b/>
-          <w:bCs/>
-        </w:rPr>
-        <w:t>/</w:t>
+        <w:lastRenderedPageBreak/>
+        <w:t xml:space="preserve">Run the project: </w:t>
+      </w:r>
+      <w:r>
+        <w:rPr>
+          <w:b/>
+          <w:bCs/>
+        </w:rPr>
+        <w:t>./</w:t>
       </w:r>
       <w:proofErr w:type="spellStart"/>
       <w:r>
@@ -2959,7 +2695,6 @@
           <w:b/>
           <w:bCs/>
         </w:rPr>
-        <w:lastRenderedPageBreak/>
         <w:t>5.1 Loading Data</w:t>
       </w:r>
     </w:p>
@@ -3067,15 +2802,7 @@
         </w:numPr>
       </w:pPr>
       <w:r>
-        <w:t xml:space="preserve">Check the error messages by </w:t>
-      </w:r>
-      <w:proofErr w:type="gramStart"/>
-      <w:r>
-        <w:t>running :</w:t>
-      </w:r>
-      <w:proofErr w:type="gramEnd"/>
-      <w:r>
-        <w:t xml:space="preserve"> </w:t>
+        <w:t xml:space="preserve">Check the error messages by running : </w:t>
       </w:r>
       <w:r>
         <w:rPr>
@@ -3141,12 +2868,10 @@
         <w:t xml:space="preserve">Check for missing dependencies in </w:t>
       </w:r>
       <w:proofErr w:type="spellStart"/>
-      <w:proofErr w:type="gramStart"/>
       <w:r>
         <w:t>build.gradle</w:t>
       </w:r>
       <w:proofErr w:type="spellEnd"/>
-      <w:proofErr w:type="gramEnd"/>
     </w:p>
     <w:p>
       <w:pPr>
@@ -3156,7 +2881,6 @@
           <w:numId w:val="9"/>
         </w:numPr>
       </w:pPr>
-      <w:proofErr w:type="gramStart"/>
       <w:r>
         <w:t xml:space="preserve">Run </w:t>
       </w:r>
@@ -3165,15 +2889,7 @@
           <w:b/>
           <w:bCs/>
         </w:rPr>
-        <w:t>.</w:t>
-      </w:r>
-      <w:proofErr w:type="gramEnd"/>
-      <w:r>
-        <w:rPr>
-          <w:b/>
-          <w:bCs/>
-        </w:rPr>
-        <w:t>/</w:t>
+        <w:t>./</w:t>
       </w:r>
       <w:proofErr w:type="spellStart"/>
       <w:r>
@@ -3227,12 +2943,10 @@
         <w:t xml:space="preserve">Add these dependencies in your </w:t>
       </w:r>
       <w:proofErr w:type="spellStart"/>
-      <w:proofErr w:type="gramStart"/>
       <w:r>
         <w:t>build.gradle</w:t>
       </w:r>
       <w:proofErr w:type="spellEnd"/>
-      <w:proofErr w:type="gramEnd"/>
       <w:r>
         <w:t>:</w:t>
       </w:r>
@@ -3246,24 +2960,16 @@
         <w:rPr>
           <w:highlight w:val="lightGray"/>
         </w:rPr>
-        <w:t xml:space="preserve">dependencies </w:t>
-      </w:r>
-      <w:proofErr w:type="gramStart"/>
+        <w:t xml:space="preserve">dependencies { </w:t>
+      </w:r>
+      <w:proofErr w:type="spellStart"/>
       <w:r>
         <w:rPr>
           <w:highlight w:val="lightGray"/>
         </w:rPr>
-        <w:t xml:space="preserve">{ </w:t>
-      </w:r>
-      <w:proofErr w:type="spellStart"/>
-      <w:r>
-        <w:rPr>
-          <w:highlight w:val="lightGray"/>
-        </w:rPr>
         <w:t>testImplementation</w:t>
       </w:r>
       <w:proofErr w:type="spellEnd"/>
-      <w:proofErr w:type="gramEnd"/>
       <w:r>
         <w:rPr>
           <w:highlight w:val="lightGray"/>
@@ -3304,21 +3010,12 @@
         <w:t xml:space="preserve">import static </w:t>
       </w:r>
       <w:proofErr w:type="spellStart"/>
-      <w:proofErr w:type="gramStart"/>
-      <w:r>
-        <w:rPr>
-          <w:b/>
-          <w:bCs/>
-        </w:rPr>
-        <w:t>org.mockito</w:t>
-      </w:r>
-      <w:proofErr w:type="gramEnd"/>
-      <w:r>
-        <w:rPr>
-          <w:b/>
-          <w:bCs/>
-        </w:rPr>
-        <w:t>.Mockito</w:t>
+      <w:r>
+        <w:rPr>
+          <w:b/>
+          <w:bCs/>
+        </w:rPr>
+        <w:t>org.mockito.Mockito</w:t>
       </w:r>
       <w:proofErr w:type="spellEnd"/>
       <w:r>
@@ -3407,16 +3104,11 @@
       <w:r>
         <w:t>Could not resolve dependencies</w:t>
       </w:r>
-      <w:proofErr w:type="gramStart"/>
       <w:r>
         <w:t xml:space="preserve">’ </w:t>
       </w:r>
       <w:r>
-        <w:t>:</w:t>
-      </w:r>
-      <w:proofErr w:type="gramEnd"/>
-      <w:r>
-        <w:t xml:space="preserve"> Run </w:t>
+        <w:t xml:space="preserve">: Run </w:t>
       </w:r>
       <w:r>
         <w:rPr>
@@ -3469,11 +3161,7 @@
       </w:r>
       <w:proofErr w:type="spellEnd"/>
       <w:r>
-        <w:t xml:space="preserve"> by running</w:t>
-      </w:r>
-      <w:proofErr w:type="gramStart"/>
-      <w:r>
-        <w:t>:</w:t>
+        <w:t xml:space="preserve"> by running:</w:t>
       </w:r>
       <w:r>
         <w:t xml:space="preserve"> </w:t>
@@ -3483,15 +3171,7 @@
           <w:b/>
           <w:bCs/>
         </w:rPr>
-        <w:t>.</w:t>
-      </w:r>
-      <w:proofErr w:type="gramEnd"/>
-      <w:r>
-        <w:rPr>
-          <w:b/>
-          <w:bCs/>
-        </w:rPr>
-        <w:t>/</w:t>
+        <w:t>./</w:t>
       </w:r>
       <w:proofErr w:type="spellStart"/>
       <w:r>
@@ -3543,13 +3223,8 @@
       </w:r>
       <w:proofErr w:type="spellEnd"/>
       <w:r>
-        <w:t xml:space="preserve"> error pertains try rebuilding everything </w:t>
-      </w:r>
-      <w:proofErr w:type="gramStart"/>
-      <w:r>
-        <w:t>by :</w:t>
-      </w:r>
-      <w:proofErr w:type="gramEnd"/>
+        <w:t xml:space="preserve"> error pertains try rebuilding everything by :</w:t>
+      </w:r>
     </w:p>
     <w:p>
       <w:pPr>
@@ -3565,15 +3240,7 @@
           <w:b/>
           <w:bCs/>
         </w:rPr>
-        <w:t>rm -</w:t>
-      </w:r>
-      <w:proofErr w:type="gramStart"/>
-      <w:r>
-        <w:rPr>
-          <w:b/>
-          <w:bCs/>
-        </w:rPr>
-        <w:t>rf .</w:t>
+        <w:t>rm -rf .</w:t>
       </w:r>
       <w:proofErr w:type="spellStart"/>
       <w:r>
@@ -3584,7 +3251,6 @@
         <w:t>gradle</w:t>
       </w:r>
       <w:proofErr w:type="spellEnd"/>
-      <w:proofErr w:type="gramEnd"/>
       <w:r>
         <w:rPr>
           <w:b/>
@@ -3602,7 +3268,6 @@
           <w:bCs/>
         </w:rPr>
       </w:pPr>
-      <w:proofErr w:type="gramStart"/>
       <w:r>
         <w:rPr>
           <w:b/>
@@ -3611,7 +3276,6 @@
         <w:t>./</w:t>
       </w:r>
       <w:proofErr w:type="spellStart"/>
-      <w:proofErr w:type="gramEnd"/>
       <w:r>
         <w:rPr>
           <w:b/>
@@ -3766,6 +3430,7 @@
         </w:numPr>
       </w:pPr>
       <w:r>
+        <w:lastRenderedPageBreak/>
         <w:t>touch "C:\</w:t>
       </w:r>
       <w:r>
@@ -3789,6 +3454,154 @@
       </w:r>
     </w:p>
     <w:p/>
+    <w:p/>
+    <w:p/>
+    <w:p/>
+    <w:p>
+      <w:r>
+        <w:rPr>
+          <w:b/>
+          <w:bCs/>
+        </w:rPr>
+        <w:t>5.3 Expected Output</w:t>
+      </w:r>
+    </w:p>
+    <w:p>
+      <w:r>
+        <w:t xml:space="preserve">Please note that a disk file is provided for you at the path specified in main. If you would like to create your own, do so, and update the filename in the Main class. </w:t>
+      </w:r>
+    </w:p>
+    <w:p>
+      <w:r>
+        <w:t xml:space="preserve">If you would like to populate the file with entries, which is necessary for </w:t>
+      </w:r>
+      <w:proofErr w:type="spellStart"/>
+      <w:r>
+        <w:t>loadDataset</w:t>
+      </w:r>
+      <w:proofErr w:type="spellEnd"/>
+      <w:r>
+        <w:t xml:space="preserve"> to run, do so by calling </w:t>
+      </w:r>
+      <w:proofErr w:type="spellStart"/>
+      <w:r>
+        <w:t>bufferManager.populateDisk</w:t>
+      </w:r>
+      <w:proofErr w:type="spellEnd"/>
+      <w:r>
+        <w:t xml:space="preserve">(), which populates the disk with as many records as provided with the </w:t>
+      </w:r>
+      <w:proofErr w:type="spellStart"/>
+      <w:r>
+        <w:t>tsv</w:t>
+      </w:r>
+      <w:proofErr w:type="spellEnd"/>
+      <w:r>
+        <w:t xml:space="preserve"> file for movie info at the provided </w:t>
+      </w:r>
+      <w:proofErr w:type="spellStart"/>
+      <w:r>
+        <w:t>filepath</w:t>
+      </w:r>
+      <w:proofErr w:type="spellEnd"/>
+      <w:r>
+        <w:t>. This will store records continuously in a packed data format up until record n, meaning that all pages will be completely populated except for the last one if a non-multiple of 105 is passed, otherwise, all pages will be completely populated.</w:t>
+      </w:r>
+    </w:p>
+    <w:p/>
+    <w:p/>
+    <w:p>
+      <w:r>
+        <w:t>Output of running the main class application with a populated disk:</w:t>
+      </w:r>
+    </w:p>
+    <w:p>
+      <w:r>
+        <w:lastRenderedPageBreak/>
+        <w:drawing>
+          <wp:inline distT="0" distB="0" distL="0" distR="0" wp14:anchorId="31E8B425" wp14:editId="6FDCF4AF">
+            <wp:extent cx="4448796" cy="5229955"/>
+            <wp:effectExtent l="0" t="0" r="9525" b="8890"/>
+            <wp:docPr id="87722246" name="Picture 1" descr="A screenshot of a computer program&#10;&#10;AI-generated content may be incorrect."/>
+            <wp:cNvGraphicFramePr>
+              <a:graphicFrameLocks xmlns:a="http://schemas.openxmlformats.org/drawingml/2006/main" noChangeAspect="1"/>
+            </wp:cNvGraphicFramePr>
+            <a:graphic xmlns:a="http://schemas.openxmlformats.org/drawingml/2006/main">
+              <a:graphicData uri="http://schemas.openxmlformats.org/drawingml/2006/picture">
+                <pic:pic xmlns:pic="http://schemas.openxmlformats.org/drawingml/2006/picture">
+                  <pic:nvPicPr>
+                    <pic:cNvPr id="87722246" name="Picture 1" descr="A screenshot of a computer program&#10;&#10;AI-generated content may be incorrect."/>
+                    <pic:cNvPicPr/>
+                  </pic:nvPicPr>
+                  <pic:blipFill>
+                    <a:blip r:embed="rId10"/>
+                    <a:stretch>
+                      <a:fillRect/>
+                    </a:stretch>
+                  </pic:blipFill>
+                  <pic:spPr>
+                    <a:xfrm>
+                      <a:off x="0" y="0"/>
+                      <a:ext cx="4448796" cy="5229955"/>
+                    </a:xfrm>
+                    <a:prstGeom prst="rect">
+                      <a:avLst/>
+                    </a:prstGeom>
+                  </pic:spPr>
+                </pic:pic>
+              </a:graphicData>
+            </a:graphic>
+          </wp:inline>
+        </w:drawing>
+      </w:r>
+    </w:p>
+    <w:p/>
+    <w:p/>
+    <w:p/>
+    <w:p>
+      <w:r>
+        <w:t>Output of running tests:</w:t>
+      </w:r>
+    </w:p>
+    <w:p>
+      <w:r>
+        <w:drawing>
+          <wp:inline distT="0" distB="0" distL="0" distR="0" wp14:anchorId="08F3B996" wp14:editId="7C4C285F">
+            <wp:extent cx="5731510" cy="1616075"/>
+            <wp:effectExtent l="0" t="0" r="2540" b="3175"/>
+            <wp:docPr id="1780336951" name="Picture 1" descr="A screenshot of a black screen&#10;&#10;AI-generated content may be incorrect."/>
+            <wp:cNvGraphicFramePr>
+              <a:graphicFrameLocks xmlns:a="http://schemas.openxmlformats.org/drawingml/2006/main" noChangeAspect="1"/>
+            </wp:cNvGraphicFramePr>
+            <a:graphic xmlns:a="http://schemas.openxmlformats.org/drawingml/2006/main">
+              <a:graphicData uri="http://schemas.openxmlformats.org/drawingml/2006/picture">
+                <pic:pic xmlns:pic="http://schemas.openxmlformats.org/drawingml/2006/picture">
+                  <pic:nvPicPr>
+                    <pic:cNvPr id="1780336951" name="Picture 1" descr="A screenshot of a black screen&#10;&#10;AI-generated content may be incorrect."/>
+                    <pic:cNvPicPr/>
+                  </pic:nvPicPr>
+                  <pic:blipFill>
+                    <a:blip r:embed="rId11"/>
+                    <a:stretch>
+                      <a:fillRect/>
+                    </a:stretch>
+                  </pic:blipFill>
+                  <pic:spPr>
+                    <a:xfrm>
+                      <a:off x="0" y="0"/>
+                      <a:ext cx="5731510" cy="1616075"/>
+                    </a:xfrm>
+                    <a:prstGeom prst="rect">
+                      <a:avLst/>
+                    </a:prstGeom>
+                  </pic:spPr>
+                </pic:pic>
+              </a:graphicData>
+            </a:graphic>
+          </wp:inline>
+        </w:drawing>
+      </w:r>
+    </w:p>
     <w:p>
       <w:r>
         <w:rPr>
@@ -3800,11 +3613,8 @@
     </w:p>
     <w:p>
       <w:r>
-        <w:t xml:space="preserve">The Buffer Manager and Page System provides an efficient mechanism for handling large-scale movie data storage and retrieval. With its structured page-based storage, LRU-based eviction policy, and robust disk management utilities, the system is designed to balance memory constraints with </w:t>
-      </w:r>
-      <w:r>
         <w:lastRenderedPageBreak/>
-        <w:t>performance efficiency. Although it currently operates under the assumption of an insert-only workload with no indexing support, future improvements could enhance its scalability and query optimization. This documentation serves as a comprehensive guide to the design, implementation, and usage of the system, ensuring clarity for both developers and users.</w:t>
+        <w:t>The Buffer Manager and Page System provides an efficient mechanism for handling large-scale movie data storage and retrieval. With its structured page-based storage, LRU-based eviction policy, and robust disk management utilities, the system is designed to balance memory constraints with performance efficiency. Although it currently operates under the assumption of an insert-only workload with no indexing support, future improvements could enhance its scalability and query optimization. This documentation serves as a comprehensive guide to the design, implementation, and usage of the system, ensuring clarity for both developers and users.</w:t>
       </w:r>
     </w:p>
     <w:p>
@@ -6962,6 +6772,36 @@
       <w:szCs w:val="20"/>
     </w:rPr>
   </w:style>
+  <w:style w:type="paragraph" w:styleId="HTMLPreformatted">
+    <w:name w:val="HTML Preformatted"/>
+    <w:basedOn w:val="Normal"/>
+    <w:link w:val="HTMLPreformattedChar"/>
+    <w:uiPriority w:val="99"/>
+    <w:semiHidden/>
+    <w:unhideWhenUsed/>
+    <w:rsid w:val="00222CF2"/>
+    <w:pPr>
+      <w:spacing w:after="0" w:line="240" w:lineRule="auto"/>
+    </w:pPr>
+    <w:rPr>
+      <w:rFonts w:ascii="Consolas" w:hAnsi="Consolas"/>
+      <w:sz w:val="20"/>
+      <w:szCs w:val="20"/>
+    </w:rPr>
+  </w:style>
+  <w:style w:type="character" w:customStyle="1" w:styleId="HTMLPreformattedChar">
+    <w:name w:val="HTML Preformatted Char"/>
+    <w:basedOn w:val="DefaultParagraphFont"/>
+    <w:link w:val="HTMLPreformatted"/>
+    <w:uiPriority w:val="99"/>
+    <w:semiHidden/>
+    <w:rsid w:val="00222CF2"/>
+    <w:rPr>
+      <w:rFonts w:ascii="Consolas" w:hAnsi="Consolas"/>
+      <w:sz w:val="20"/>
+      <w:szCs w:val="20"/>
+    </w:rPr>
+  </w:style>
 </w:styles>
 </file>
 

</xml_diff>